<commit_message>
refactor: move letterhead download to Export Enquiries and update footer details
</commit_message>
<xml_diff>
--- a/BA_Foods_Blank_Letterhead.docx
+++ b/BA_Foods_Blank_Letterhead.docx
@@ -78,20 +78,10 @@
             <w:rPr>
               <w:rFonts w:ascii="Trebuchet MS" w:hAnsi="Trebuchet MS"/>
               <w:b/>
-              <w:color w:val="8C763E"/>
-              <w:sz w:val="16"/>
+              <w:color w:val="1E3D2F"/>
+              <w:sz w:val="17"/>
             </w:rPr>
             <w:t>BA FOODS</w:t>
-            <w:br/>
-          </w:r>
-          <w:r>
-            <w:rPr>
-              <w:rFonts w:ascii="Trebuchet MS" w:hAnsi="Trebuchet MS"/>
-              <w:b/>
-              <w:color w:val="1E3D2F"/>
-              <w:sz w:val="14"/>
-            </w:rPr>
-            <w:t>Halal Export Approved</w:t>
             <w:br/>
           </w:r>
           <w:r>
@@ -135,15 +125,6 @@
               <w:b/>
               <w:color w:val="1E3D2F"/>
               <w:sz w:val="17"/>
-            </w:rPr>
-            <w:t>Bilal Ashraf</w:t>
-            <w:br/>
-          </w:r>
-          <w:r>
-            <w:rPr>
-              <w:rFonts w:ascii="Trebuchet MS" w:hAnsi="Trebuchet MS"/>
-              <w:color w:val="6B7280"/>
-              <w:sz w:val="15"/>
             </w:rPr>
             <w:t>Managing Director / Export Desk</w:t>
           </w:r>

</xml_diff>

<commit_message>
refactor: remove designation title from letterhead signatory cell
</commit_message>
<xml_diff>
--- a/BA_Foods_Blank_Letterhead.docx
+++ b/BA_Foods_Blank_Letterhead.docx
@@ -117,16 +117,6 @@
               <w:color w:val="9CA3AF"/>
             </w:rPr>
             <w:t>_________________________</w:t>
-            <w:br/>
-          </w:r>
-          <w:r>
-            <w:rPr>
-              <w:rFonts w:ascii="Trebuchet MS" w:hAnsi="Trebuchet MS"/>
-              <w:b/>
-              <w:color w:val="1E3D2F"/>
-              <w:sz w:val="17"/>
-            </w:rPr>
-            <w:t>Managing Director / Export Desk</w:t>
           </w:r>
         </w:p>
       </w:tc>

</xml_diff>